<commit_message>
Small changes to make lab 2 easier to read with better instructions and also the Stub lab
</commit_message>
<xml_diff>
--- a/Labs/EG 04-Stubs.docx
+++ b/Labs/EG 04-Stubs.docx
@@ -49,118 +49,126 @@
           <w:szCs w:val="24"/>
         </w:rPr>
         <w:br/>
-      </w:r>
-      <w:r>
-        <w:rPr>
+        <w:t xml:space="preserve">A </w:t>
+      </w:r>
+      <w:r>
+        <w:rPr>
+          <w:b/>
+          <w:bCs/>
           <w:sz w:val="24"/>
           <w:szCs w:val="24"/>
         </w:rPr>
-        <w:t xml:space="preserve">A </w:t>
-      </w:r>
-      <w:r>
-        <w:rPr>
-          <w:b/>
-          <w:bCs/>
+        <w:t>stub</w:t>
+      </w:r>
+      <w:r>
+        <w:rPr>
           <w:sz w:val="24"/>
           <w:szCs w:val="24"/>
         </w:rPr>
-        <w:t>stub</w:t>
+        <w:t xml:space="preserve"> is a lightweight stand</w:t>
       </w:r>
       <w:r>
         <w:rPr>
           <w:sz w:val="24"/>
           <w:szCs w:val="24"/>
         </w:rPr>
-        <w:t xml:space="preserve"> is a lightweight stand</w:t>
-      </w:r>
-      <w:r>
-        <w:rPr>
+        <w:noBreakHyphen/>
+        <w:t xml:space="preserve">in for a real component. It does not connect to a real database. It simply returns </w:t>
+      </w:r>
+      <w:r>
+        <w:rPr>
+          <w:b/>
+          <w:bCs/>
           <w:sz w:val="24"/>
           <w:szCs w:val="24"/>
         </w:rPr>
-        <w:noBreakHyphen/>
-        <w:t xml:space="preserve">in for a real component. It does not connect to a real database. It simply returns </w:t>
-      </w:r>
-      <w:r>
-        <w:rPr>
-          <w:b/>
-          <w:bCs/>
+        <w:t>fixed, predictable data</w:t>
+      </w:r>
+      <w:r>
+        <w:rPr>
           <w:sz w:val="24"/>
           <w:szCs w:val="24"/>
         </w:rPr>
-        <w:t>fixed, predictable data</w:t>
-      </w:r>
-      <w:r>
+        <w:t xml:space="preserve"> so that your tests can run.</w:t>
+      </w:r>
+    </w:p>
+    <w:p>
+      <w:pPr>
+        <w:rPr>
+          <w:b/>
+          <w:bCs/>
+        </w:rPr>
+      </w:pPr>
+    </w:p>
+    <w:p>
+      <w:pPr>
+        <w:pStyle w:val="Heading2"/>
+      </w:pPr>
+      <w:r>
+        <w:t>Creating a Stub for the User Database</w:t>
+      </w:r>
+    </w:p>
+    <w:p>
+      <w:pPr>
         <w:rPr>
           <w:sz w:val="24"/>
           <w:szCs w:val="24"/>
         </w:rPr>
-        <w:t xml:space="preserve"> so that your tests can run.</w:t>
-      </w:r>
-    </w:p>
-    <w:p>
-      <w:pPr>
-        <w:rPr>
-          <w:b/>
-          <w:bCs/>
-        </w:rPr>
-      </w:pPr>
-    </w:p>
-    <w:p>
-      <w:pPr>
-        <w:pStyle w:val="Heading2"/>
-      </w:pPr>
-      <w:r>
-        <w:t>Creating a Stub for the User Database</w:t>
-      </w:r>
-    </w:p>
-    <w:p>
-      <w:pPr>
+      </w:pPr>
+      <w:r>
         <w:rPr>
           <w:sz w:val="24"/>
           <w:szCs w:val="24"/>
         </w:rPr>
-      </w:pPr>
-      <w:r>
-        <w:rPr>
+        <w:t xml:space="preserve">In the previous exercise, the </w:t>
+      </w:r>
+      <w:proofErr w:type="spellStart"/>
+      <w:r>
+        <w:rPr>
+          <w:b/>
+          <w:bCs/>
           <w:sz w:val="24"/>
           <w:szCs w:val="24"/>
         </w:rPr>
-        <w:t xml:space="preserve">In the previous exercise, the </w:t>
-      </w:r>
-      <w:proofErr w:type="spellStart"/>
-      <w:r>
-        <w:rPr>
-          <w:b/>
-          <w:bCs/>
+        <w:t>UserService</w:t>
+      </w:r>
+      <w:proofErr w:type="spellEnd"/>
+      <w:r>
+        <w:rPr>
           <w:sz w:val="24"/>
           <w:szCs w:val="24"/>
         </w:rPr>
-        <w:t>UserService</w:t>
-      </w:r>
-      <w:proofErr w:type="spellEnd"/>
-      <w:r>
-        <w:rPr>
+        <w:t xml:space="preserve"> did not store any users because we do not have a real database yet. In this task, you will create a </w:t>
+      </w:r>
+      <w:r>
+        <w:rPr>
+          <w:b/>
+          <w:bCs/>
           <w:sz w:val="24"/>
           <w:szCs w:val="24"/>
         </w:rPr>
-        <w:t xml:space="preserve"> did not store any users because we do not have a real database yet. In this task, you will create a </w:t>
-      </w:r>
-      <w:r>
-        <w:rPr>
-          <w:b/>
-          <w:bCs/>
+        <w:t>stub</w:t>
+      </w:r>
+      <w:r>
+        <w:rPr>
           <w:sz w:val="24"/>
           <w:szCs w:val="24"/>
         </w:rPr>
-        <w:t>stub</w:t>
+        <w:t xml:space="preserve"> </w:t>
       </w:r>
       <w:r>
         <w:rPr>
           <w:sz w:val="24"/>
           <w:szCs w:val="24"/>
         </w:rPr>
-        <w:t xml:space="preserve"> — a simple, fake version of the database so that we can test behaviours that depend on stored users.</w:t>
+        <w:t xml:space="preserve">which is </w:t>
+      </w:r>
+      <w:r>
+        <w:rPr>
+          <w:sz w:val="24"/>
+          <w:szCs w:val="24"/>
+        </w:rPr>
+        <w:t>a simple, fake version of the database so that we can test behaviours that depend on stored users.</w:t>
       </w:r>
       <w:r>
         <w:rPr>
@@ -407,19 +415,16 @@
         <w:br w:type="page"/>
       </w:r>
     </w:p>
-    <w:p/>
     <w:p>
       <w:pPr>
         <w:pStyle w:val="Heading1"/>
       </w:pPr>
       <w:r>
-        <w:t xml:space="preserve">Extra </w:t>
-      </w:r>
-      <w:r>
-        <w:t xml:space="preserve">Lab  – </w:t>
-      </w:r>
-      <w:r>
-        <w:t xml:space="preserve">Using Stubs in for </w:t>
+        <w:lastRenderedPageBreak/>
+        <w:t xml:space="preserve">Extra Lab  – </w:t>
+      </w:r>
+      <w:r>
+        <w:t xml:space="preserve">Using Stubs for </w:t>
       </w:r>
       <w:r>
         <w:t>a Library</w:t>
@@ -1085,6 +1090,56 @@
       <w:proofErr w:type="spellEnd"/>
       <w:r>
         <w:t>, User user)</w:t>
+      </w:r>
+      <w:r>
+        <w:t xml:space="preserve">  </w:t>
+      </w:r>
+      <w:r>
+        <w:rPr>
+          <w:b/>
+          <w:bCs/>
+          <w:color w:val="3A7C22" w:themeColor="accent6" w:themeShade="BF"/>
+        </w:rPr>
+        <w:t>//</w:t>
+      </w:r>
+      <w:r>
+        <w:rPr>
+          <w:b/>
+          <w:bCs/>
+          <w:color w:val="215E99" w:themeColor="text2" w:themeTint="BF"/>
+        </w:rPr>
+        <w:t xml:space="preserve"> </w:t>
+      </w:r>
+      <w:r>
+        <w:rPr>
+          <w:b/>
+          <w:bCs/>
+          <w:color w:val="215E99" w:themeColor="text2" w:themeTint="BF"/>
+        </w:rPr>
+        <w:t>public</w:t>
+      </w:r>
+      <w:r>
+        <w:t xml:space="preserve"> </w:t>
+      </w:r>
+      <w:r>
+        <w:rPr>
+          <w:b/>
+          <w:bCs/>
+          <w:color w:val="80340D" w:themeColor="accent2" w:themeShade="80"/>
+        </w:rPr>
+        <w:t>bool</w:t>
+      </w:r>
+      <w:r>
+        <w:rPr>
+          <w:color w:val="80340D" w:themeColor="accent2" w:themeShade="80"/>
+        </w:rPr>
+        <w:t xml:space="preserve"> </w:t>
+      </w:r>
+      <w:r>
+        <w:rPr>
+          <w:color w:val="3A7C22" w:themeColor="accent6" w:themeShade="BF"/>
+        </w:rPr>
+        <w:t>for C# developers</w:t>
       </w:r>
     </w:p>
     <w:p>
@@ -5350,6 +5405,7 @@
   <w:style w:type="character" w:default="1" w:styleId="DefaultParagraphFont">
     <w:name w:val="Default Paragraph Font"/>
     <w:uiPriority w:val="1"/>
+    <w:semiHidden/>
     <w:unhideWhenUsed/>
   </w:style>
   <w:style w:type="table" w:default="1" w:styleId="TableNormal">

</xml_diff>